<commit_message>
Hogar de Refugio: comparación del metrado de evacuación de arquitectura con el plano de señalización
Lector: posición sin textos y edificación con más holgura donde los contornos se traslapan; reparto de
la señal de riesgo eléctrico tomado del metrado de arquitectura; Excel de comparación y sección en la nota.

Co-Authored-By: Claude Opus 5.5 <noreply@anthropic.com>
Claude-Session: https://claude.ai/code/session_0142t8T16igb3VKxUPwnQPq6
</commit_message>
<xml_diff>
--- a/entregables/ESPECIFICACIONES_TECNICAS_SENALIZACION_Y_SEGURIDAD_HOGAR_REFUGIO.docx
+++ b/entregables/ESPECIFICACIONES_TECNICAS_SENALIZACION_Y_SEGURIDAD_HOGAR_REFUGIO.docx
@@ -4513,7 +4513,7 @@
           <w:sz w:val="20"/>
           <w:szCs w:val="20"/>
         </w:rPr>
-        <w:t xml:space="preserve">Comprende el suministro e instalación de la letrero de aforo con braille, de 0.30 x 0.20 m, con el pictograma, los colores y la forma de la NTP 399.010-1 y el texto en braille (Norma A.120). Indica la capacidad máxima de personas del ambiente; junto al ingreso, en el lado de la cerradura. Se instala según la planta de la lámina SE-S-02 (E-01 (13), E-02 (4), E-03 (5), E-04 (5), E-05 (4), E-06 (6), E-07 (12), E-08 (6)), a 2.10 m del piso terminado (borde inferior de la señal), en un lugar visible.</w:t>
+        <w:t xml:space="preserve">Comprende el suministro e instalación de la letrero de aforo con braille, de 0.30 x 0.20 m, con el pictograma, los colores y la forma de la NTP 399.010-1 y el texto en braille (Norma A.120). Indica la capacidad máxima de personas del ambiente; junto al ingreso, en el lado de la cerradura. Se instala según la planta de la lámina SE-S-02 (E-01 (10), E-02 (3), E-03 (5), E-04 (7), E-05 (5), E-06 (6), E-07 (12), E-08 (6), E-09 (1)), a 2.10 m del piso terminado (borde inferior de la señal), en un lugar visible.</w:t>
       </w:r>
     </w:p>
     <w:p>
@@ -5109,7 +5109,7 @@
           <w:sz w:val="20"/>
           <w:szCs w:val="20"/>
         </w:rPr>
-        <w:t xml:space="preserve">Comprende el suministro e instalación de la señal de ubicación de extintor PQS con braille, de 0.20 x 0.30 m, con el pictograma, los colores y la forma de la NTP 399.010-1 y el texto en braille (Norma A.120). Identifica la ubicación del extintor de polvo químico seco; sobre el equipo. Se instala según la planta de la lámina SE-S-02 (E-01 (3), E-02 (5), E-03 (3), E-04 (2), E-05 (3), E-06 (4), E-07 (8), E-08 (4), E-09 (1)), a 1.80 m del piso terminado (borde inferior de la señal), visible desde la ruta de evacuación y sin obstáculos delante.</w:t>
+        <w:t xml:space="preserve">Comprende el suministro e instalación de la señal de ubicación de extintor PQS con braille, de 0.20 x 0.30 m, con el pictograma, los colores y la forma de la NTP 399.010-1 y el texto en braille (Norma A.120). Identifica la ubicación del extintor de polvo químico seco; sobre el equipo. Se instala según la planta de la lámina SE-S-02 (E-01 (3), E-02 (4), E-03 (3), E-04 (2), E-05 (4), E-06 (4), E-07 (8), E-08 (4), E-09 (1)), a 1.80 m del piso terminado (borde inferior de la señal), visible desde la ruta de evacuación y sin obstáculos delante.</w:t>
       </w:r>
     </w:p>
     <w:p>
@@ -5686,7 +5686,7 @@
           <w:sz w:val="20"/>
           <w:szCs w:val="20"/>
         </w:rPr>
-        <w:t xml:space="preserve">Comprende el suministro e instalación de la señal de atención riesgo eléctrico con braille, de 0.20 x 0.30 m, con el pictograma, los colores y la forma de la NTP 399.010-1 y el texto en braille (Norma A.120). Advierte la presencia de tableros y equipos eléctricos; en la puerta o el frente del tablero. Se instala según la lámina SE-S-02, en los tableros y ambientes eléctricos que indica, en coordinación con el plano de instalaciones eléctricas, a 1.10 m del piso terminado (borde inferior de la señal), en un lugar visible.</w:t>
+        <w:t xml:space="preserve">Comprende el suministro e instalación de la señal de atención riesgo eléctrico con braille, de 0.20 x 0.30 m, con el pictograma, los colores y la forma de la NTP 399.010-1 y el texto en braille (Norma A.120). Advierte la presencia de tableros y equipos eléctricos; en la puerta o el frente del tablero. Se instala según la planta de la lámina SE-S-02 (E-01 (8), E-02 (2), E-03 (2), E-04 (5), E-05 (3), E-06 (6), E-07 (6), E-08 (6), E-09 (1)), a 1.10 m del piso terminado (borde inferior de la señal), en un lugar visible.</w:t>
       </w:r>
     </w:p>
     <w:p>
@@ -6137,7 +6137,7 @@
           <w:sz w:val="20"/>
           <w:szCs w:val="20"/>
         </w:rPr>
-        <w:t xml:space="preserve">Se contará el número de señales suministradas e instaladas a satisfacción de la Supervisión, según la leyenda de la lámina SE-S-02 y su ubicación en obra.</w:t>
+        <w:t xml:space="preserve">Se contará el número de señales suministradas e instaladas a satisfacción de la Supervisión, según la planta de la lámina SE-S-02 y la hoja METRADO.</w:t>
       </w:r>
     </w:p>
     <w:p>
@@ -9112,7 +9112,7 @@
           <w:sz w:val="20"/>
           <w:szCs w:val="20"/>
         </w:rPr>
-        <w:t xml:space="preserve">Comprende el suministro e instalación del extintor de polvo químico seco (PQS) tipo ABC de 9 kg, nuevo, con certificación de calidad, en las edificaciones E-01 (3), E-02 (5), E-03 (3), E-04 (2), E-05 (3), E-06 (4), E-07 (8), E-08 (4), E-09 (1), junto a su señal de ubicación. Combate fuegos de clase A, B y C en las nueve edificaciones.</w:t>
+        <w:t xml:space="preserve">Comprende el suministro e instalación del extintor de polvo químico seco (PQS) tipo ABC de 9 kg, nuevo, con certificación de calidad, en las edificaciones E-01 (3), E-02 (4), E-03 (3), E-04 (2), E-05 (4), E-06 (4), E-07 (8), E-08 (4), E-09 (1), junto a su señal de ubicación. Combate fuegos de clase A, B y C en las nueve edificaciones.</w:t>
       </w:r>
     </w:p>
     <w:p>
@@ -9623,7 +9623,7 @@
           <w:sz w:val="20"/>
           <w:szCs w:val="20"/>
         </w:rPr>
-        <w:t xml:space="preserve">Comprende el suministro e instalación de las unidades de luces de emergencia autónomas en salidas, circulaciones, habitaciones y ambientes, a 2.10 m del piso, según la planta de la lámina SE-S-02 (E-01 (17), E-02 (3), E-03 (9), E-04 (19), E-05 (17), E-06 (12), E-07 (21), E-08 (12), E-09 (5)). Se encienden automáticamente al cortarse la energía y dan iluminación a las rutas de evacuación durante al menos 90 minutos (Norma A.130).</w:t>
+        <w:t xml:space="preserve">Comprende el suministro e instalación de las unidades de luces de emergencia autónomas en salidas, circulaciones, habitaciones y ambientes, a 2.10 m del piso, según la planta de la lámina SE-S-02 (E-01 (16), E-02 (2), E-03 (9), E-04 (20), E-05 (18), E-06 (12), E-07 (21), E-08 (12), E-09 (5)). Se encienden automáticamente al cortarse la energía y dan iluminación a las rutas de evacuación durante al menos 90 minutos (Norma A.130).</w:t>
       </w:r>
     </w:p>
     <w:p>

</xml_diff>